<commit_message>
Informe: enlace al repositorio, referencias restauradas y declaración de IA
- Enlace real al repositorio (hipervínculo) para que el docente pueda entrar.
- Se restaura el título Referencias y las referencias de Chen (2024),
  Cormack et al. (2009) y Es et al. (2024), que se habían perdido.
- Anexo A según la pauta y la guía de Bibliotecas Duoc UC: herramienta,
  uso, instrucción de ejemplo y validación; cita APA de la herramienta.
- Títulos de reflexiones con el mismo estilo que el resto de subtítulos.

Co-Authored-By: Claude Opus 5.5 <noreply@anthropic.com>
</commit_message>
<xml_diff>
--- a/informe/Informe Chuquicamata (corregido).docx
+++ b/informe/Informe Chuquicamata (corregido).docx
@@ -240,25 +240,19 @@
           <w:sz w:val="18"/>
           <w:szCs w:val="18"/>
         </w:rPr>
-        <w:t>Repositorio: https://github.com/&lt;usuario&gt;/asistente-faena-rag</w:t>
-      </w:r>
-      <w:r>
-        <w:rPr>
-          <w:color w:val="52606D"/>
-          <w:sz w:val="18"/>
-          <w:szCs w:val="18"/>
-        </w:rPr>
-        <w:t xml:space="preserve">  </w:t>
-      </w:r>
-      <w:r>
-        <w:rPr>
-          <w:color w:val="52606D"/>
-          <w:sz w:val="18"/>
-          <w:szCs w:val="18"/>
-          <w:highlight w:val="yellow"/>
-        </w:rPr>
-        <w:t>[PENDIENTE — Cindia Maldonado / Isaac Román: reemplazar por el enlace real del repositorio en GitHub]</w:t>
-      </w:r>
+        <w:t xml:space="preserve">Repositorio: </w:t>
+      </w:r>
+      <w:hyperlink r:id="rIdRepo" w:history="1">
+        <w:r>
+          <w:rPr>
+            <w:color w:val="1F4E9D"/>
+            <w:sz w:val="18"/>
+            <w:szCs w:val="18"/>
+            <w:u w:val="single"/>
+          </w:rPr>
+          <w:t>https://github.com/cindia17/asistente-faena-rag</w:t>
+        </w:r>
+      </w:hyperlink>
     </w:p>
     <w:p>
       <w:pPr>
@@ -5138,8 +5132,58 @@
     </w:p>
     <w:p>
       <w:pPr>
+        <w:pStyle w:val="Ttulo2"/>
+        <w:spacing w:before="110" w:after="55"/>
+      </w:pPr>
+      <w:r>
+        <w:rPr>
+          <w:b/>
+          <w:bCs/>
+          <w:color w:val="1F2933"/>
+          <w:sz w:val="23"/>
+          <w:szCs w:val="23"/>
+        </w:rPr>
+        <w:t>6.1 Reflexión individual — Cindia Maldonado</w:t>
+      </w:r>
+    </w:p>
+    <w:p>
+      <w:r>
+        <w:rPr>
+          <w:highlight w:val="yellow"/>
+        </w:rPr>
+        <w:t>[PENDIENTE — Cindia Maldonado: redactar personalmente, SIN apoyo de IA (lo exige la pauta), en 5 a 8 líneas: qué aprendiste en el proyecto y cuál fue tu contribución concreta (qué partes hiciste).]</w:t>
+      </w:r>
+    </w:p>
+    <w:p>
+      <w:pPr>
+        <w:pStyle w:val="Ttulo2"/>
+        <w:spacing w:before="110" w:after="55"/>
+      </w:pPr>
+      <w:r>
+        <w:rPr>
+          <w:b/>
+          <w:bCs/>
+          <w:color w:val="1F2933"/>
+          <w:sz w:val="23"/>
+          <w:szCs w:val="23"/>
+        </w:rPr>
+        <w:t>6.2 Reflexión individual — Isaac Román</w:t>
+      </w:r>
+    </w:p>
+    <w:p>
+      <w:r>
+        <w:rPr>
+          <w:highlight w:val="yellow"/>
+        </w:rPr>
+        <w:t>[PENDIENTE — Isaac Román: redactar personalmente, SIN apoyo de IA (lo exige la pauta), en 5 a 8 líneas: qué aprendiste en el proyecto y cuál fue tu contribución concreta (qué partes hiciste).]</w:t>
+      </w:r>
+    </w:p>
+    <w:p>
+      <w:pPr>
         <w:pStyle w:val="Ttulo1"/>
         <w:spacing w:before="150" w:after="70"/>
+      </w:pPr>
+      <w:r>
         <w:rPr>
           <w:b/>
           <w:bCs/>
@@ -5147,28 +5191,318 @@
           <w:sz w:val="25"/>
           <w:szCs w:val="25"/>
         </w:rPr>
-      </w:pPr>
-    </w:p>
-    <w:p>
-      <w:pPr>
-        <w:pStyle w:val="Ttulo2"/>
+        <w:t>Referencias</w:t>
+      </w:r>
+    </w:p>
+    <w:p>
+      <w:pPr>
+        <w:spacing w:after="24" w:line="188" w:lineRule="auto"/>
+        <w:ind w:left="300" w:hanging="300"/>
+      </w:pPr>
+      <w:r>
+        <w:rPr>
+          <w:sz w:val="17"/>
+          <w:szCs w:val="17"/>
+        </w:rPr>
+        <w:t xml:space="preserve">Anthropic. (2026). </w:t>
+      </w:r>
+      <w:r>
+        <w:rPr>
+          <w:i/>
+          <w:iCs/>
+          <w:sz w:val="17"/>
+          <w:szCs w:val="17"/>
+        </w:rPr>
+        <w:t>Claude Code</w:t>
+      </w:r>
+      <w:r>
+        <w:rPr>
+          <w:sz w:val="17"/>
+          <w:szCs w:val="17"/>
+        </w:rPr>
+        <w:t xml:space="preserve"> (modelo Claude Opus 5.5) [Asistente de programación basado en un modelo de lenguaje de gran tamaño]. https://claude.com/claude-code</w:t>
+      </w:r>
+    </w:p>
+    <w:p>
+      <w:pPr>
+        <w:spacing w:after="24" w:line="188" w:lineRule="auto"/>
+        <w:ind w:left="300" w:hanging="300"/>
+      </w:pPr>
+      <w:r>
+        <w:rPr>
+          <w:sz w:val="17"/>
+          <w:szCs w:val="17"/>
+        </w:rPr>
+        <w:t xml:space="preserve">Chen, J., Xiao, S., Zhang, P., Luo, K., Lian, D., &amp; Liu, Z. (2024). BGE M3-Embedding: Multi-lingual, multi-functionality, multi-granularity text embeddings through self-knowledge distillation. arXiv. https://arxiv.org/abs/2402.03216</w:t>
+      </w:r>
+    </w:p>
+    <w:p>
+      <w:pPr>
+        <w:spacing w:after="24" w:line="188" w:lineRule="auto"/>
+        <w:ind w:left="300" w:hanging="300"/>
+      </w:pPr>
+      <w:r>
+        <w:rPr>
+          <w:sz w:val="17"/>
+          <w:szCs w:val="17"/>
+        </w:rPr>
+        <w:t xml:space="preserve">Cormack, G. V., Clarke, C. L. A., &amp; Buettcher, S. (2009). Reciprocal rank fusion outperforms Condorcet and individual rank learning methods. En Proceedings of the 32nd International ACM SIGIR Conference on Research and Development in Information Retrieval (pp. 758–759). ACM. https://doi.org/10.1145/1571941.1572114</w:t>
+      </w:r>
+    </w:p>
+    <w:p>
+      <w:pPr>
+        <w:spacing w:after="24" w:line="188" w:lineRule="auto"/>
+        <w:ind w:left="300" w:hanging="300"/>
+      </w:pPr>
+      <w:r>
+        <w:rPr>
+          <w:sz w:val="17"/>
+          <w:szCs w:val="17"/>
+        </w:rPr>
+        <w:t xml:space="preserve">Es, S., James, J., Espinosa-Anke, L., &amp; Schockaert, S. (2024). RAGAS: Automated evaluation of retrieval augmented generation. En Proceedings of the 18th Conference of the European Chapter of the Association for Computational Linguistics: System Demonstrations (pp. 150–158). Association for Computational Linguistics.</w:t>
+      </w:r>
+    </w:p>
+    <w:p>
+      <w:pPr>
+        <w:spacing w:after="24" w:line="188" w:lineRule="auto"/>
+        <w:ind w:left="300" w:hanging="300"/>
+      </w:pPr>
+      <w:r>
+        <w:rPr>
+          <w:sz w:val="17"/>
+          <w:szCs w:val="17"/>
+        </w:rPr>
+        <w:t>Gao, Y., Xiong, Y., Gao, X., Jia, K., Pan, J., Bi, Y., Dai, Y., Sun, J., &amp; Wang, H. (2023). Retrieval-augmented generation for large language models: A survey. arXiv. https://arxiv.org/abs/2312.10997</w:t>
+      </w:r>
+    </w:p>
+    <w:p>
+      <w:pPr>
+        <w:spacing w:after="24" w:line="188" w:lineRule="auto"/>
+        <w:ind w:left="300" w:hanging="300"/>
+      </w:pPr>
+      <w:r>
+        <w:rPr>
+          <w:sz w:val="17"/>
+          <w:szCs w:val="17"/>
+        </w:rPr>
+        <w:t>L</w:t>
+      </w:r>
+      <w:r>
+        <w:rPr>
+          <w:sz w:val="17"/>
+          <w:szCs w:val="17"/>
+        </w:rPr>
+        <w:t>ewis, P., Perez, E., Piktus, A., Petroni, F., Karpukhin, V., Goyal, N., Küttler, H., Lewis, M., Yih, W., Rocktäschel, T., Riedel, S., &amp; Kiela, D. (2020). Retrieval-augmented generation for knowledge-intensive NLP tasks. Advances in Neural Information Processing Systems, 33, 9459–9474.</w:t>
+      </w:r>
+    </w:p>
+    <w:p>
+      <w:pPr>
+        <w:spacing w:after="24" w:line="188" w:lineRule="auto"/>
+        <w:ind w:left="300" w:hanging="300"/>
+      </w:pPr>
+      <w:r>
+        <w:rPr>
+          <w:sz w:val="17"/>
+          <w:szCs w:val="17"/>
+        </w:rPr>
+        <w:t>Ministerio de Minería. (2004). Decreto Supremo N° 132: Reglamento de Seguridad Minera. Diario Oficial de la República de Chile.</w:t>
+      </w:r>
+    </w:p>
+    <w:p>
+      <w:pPr>
+        <w:spacing w:after="24" w:line="188" w:lineRule="auto"/>
+        <w:ind w:left="300" w:hanging="300"/>
+      </w:pPr>
+      <w:r>
+        <w:rPr>
+          <w:sz w:val="17"/>
+          <w:szCs w:val="17"/>
+        </w:rPr>
+        <w:t>Musto, S., Barra, P., Gallo, L., &amp; Neroni, P. (2026). Avateacher: Enhancing industrial maintenance with private-network LLMs and retrieval-augmented generation. En Extended Reality. XR Salento 2025 (Lecture Notes in Computer Science, Vol. 15743, pp. 281–295). Springer. https://doi.org/10.1007/978-3-031-97781-7_21</w:t>
+      </w:r>
+    </w:p>
+    <w:p>
+      <w:pPr>
+        <w:spacing w:after="24" w:line="188" w:lineRule="auto"/>
+        <w:ind w:left="300" w:hanging="300"/>
+      </w:pPr>
+      <w:r>
+        <w:rPr>
+          <w:sz w:val="17"/>
+          <w:szCs w:val="17"/>
+        </w:rPr>
+        <w:t>OWASP Foundation. (2025). OWASP Top 10 for large language model applications. https://owasp.org/www-project-top-10-for-large-language-model-applications/</w:t>
+      </w:r>
+    </w:p>
+    <w:p>
+      <w:pPr>
+        <w:spacing w:after="24" w:line="188" w:lineRule="auto"/>
+        <w:ind w:left="300" w:hanging="300"/>
+      </w:pPr>
+      <w:r>
+        <w:rPr>
+          <w:sz w:val="17"/>
+          <w:szCs w:val="17"/>
+        </w:rPr>
+        <w:t>REDIMIN. (2026, septiembre). MinerIA del futuro: la inteligencia artificial ya entra en la producción minera chilena. Revista Digital Minera. https://www.redimin.cl</w:t>
+      </w:r>
+    </w:p>
+    <w:p>
+      <w:pPr>
+        <w:spacing w:after="24" w:line="188" w:lineRule="auto"/>
+        <w:ind w:left="300" w:hanging="300"/>
+      </w:pPr>
+      <w:r>
+        <w:rPr>
+          <w:sz w:val="17"/>
+          <w:szCs w:val="17"/>
+        </w:rPr>
+        <w:lastRenderedPageBreak/>
+        <w:t>Robertson, S., &amp; Zaragoza, H. (2009). The probabilistic relevance framework: BM25 and beyond. Foundations and Trends in Information Retrieval, 3(4), 333–389. https://doi.org/10.1561/1500000019</w:t>
+      </w:r>
+    </w:p>
+    <w:p>
+      <w:pPr>
+        <w:spacing w:after="24" w:line="188" w:lineRule="auto"/>
+        <w:ind w:left="300" w:hanging="300"/>
+      </w:pPr>
+      <w:r>
+        <w:rPr>
+          <w:sz w:val="17"/>
+          <w:szCs w:val="17"/>
+        </w:rPr>
+        <w:t>Servicio Nacional de Geología y Minería. (2026). Accidentabilidad minera 2025. SERNAGEOMIN. https://www.sernageomin.cl/accidentabilidad-minera/</w:t>
+      </w:r>
+    </w:p>
+    <w:p>
+      <w:pPr>
+        <w:spacing w:after="24" w:line="188" w:lineRule="auto"/>
+        <w:ind w:left="300" w:hanging="300"/>
+        <w:rPr>
+          <w:sz w:val="17"/>
+          <w:szCs w:val="17"/>
+        </w:rPr>
+      </w:pPr>
+      <w:r>
+        <w:rPr>
+          <w:sz w:val="17"/>
+          <w:szCs w:val="17"/>
+        </w:rPr>
+        <w:t>Yao, S., Zhao, J., Yu, D., Du, N., Shafran, I., Narasimhan, K., &amp; Cao, Y. (2023). ReAct: Synergizing reasoning and acting in language models. En International Conference on Learning Representations.</w:t>
+      </w:r>
+    </w:p>
+    <w:p>
+      <w:r>
+        <w:br w:type="page"/>
+      </w:r>
+    </w:p>
+    <w:p>
+      <w:pPr>
+        <w:pStyle w:val="Ttulo1"/>
+      </w:pPr>
+      <w:r>
+        <w:lastRenderedPageBreak/>
+        <w:t>Anexo A. Declaración de uso de inteligencia artificial</w:t>
+      </w:r>
+    </w:p>
+    <w:p>
+      <w:r>
+        <w:t xml:space="preserve">Conforme a las indicaciones de uso de IA de la evaluación y a la guía de Bibliotecas Duoc UC (https://bibliotecas.duoc.cl/ia), el equipo declara las herramientas de IA utilizadas, en qué se aplicaron y cómo se validó su resultado. La herramienta se cita en formato APA y figura en Referencias.</w:t>
+      </w:r>
+    </w:p>
+    <w:p>
+      <w:pPr>
+        <w:ind w:left="360" w:hanging="220"/>
+      </w:pPr>
+      <w:r>
+        <w:t xml:space="preserve">• </w:t>
+      </w:r>
+      <w:r>
         <w:rPr>
           <w:b/>
           <w:bCs/>
-          <w:color w:val="2F4A6D"/>
-          <w:sz w:val="25"/>
-          <w:szCs w:val="25"/>
-        </w:rPr>
-      </w:pPr>
+        </w:rPr>
+        <w:t xml:space="preserve">Herramienta: </w:t>
+      </w:r>
+      <w:r>
+        <w:t xml:space="preserve">Claude Code, con el modelo Claude Opus 5.5 (Anthropic, 2026).</w:t>
+      </w:r>
+    </w:p>
+    <w:p>
+      <w:pPr>
+        <w:ind w:left="360" w:hanging="220"/>
+      </w:pPr>
+      <w:r>
+        <w:t xml:space="preserve">• </w:t>
+      </w:r>
       <w:r>
         <w:rPr>
           <w:b/>
           <w:bCs/>
-          <w:color w:val="2F4A6D"/>
-          <w:sz w:val="25"/>
-          <w:szCs w:val="25"/>
-        </w:rPr>
-        <w:t>6.1 Reflexión individual — Cindia Maldonado</w:t>
+        </w:rPr>
+        <w:t xml:space="preserve">Uso en el prototipo: </w:t>
+      </w:r>
+      <w:r>
+        <w:t xml:space="preserve">apoyo en la programación del repositorio (código en Python, pruebas automatizadas, script de evaluación, README) y en su organización.</w:t>
+      </w:r>
+    </w:p>
+    <w:p>
+      <w:pPr>
+        <w:ind w:left="360" w:hanging="220"/>
+      </w:pPr>
+      <w:r>
+        <w:t xml:space="preserve">• </w:t>
+      </w:r>
+      <w:r>
+        <w:rPr>
+          <w:b/>
+          <w:bCs/>
+        </w:rPr>
+        <w:t xml:space="preserve">Uso en el informe: </w:t>
+      </w:r>
+      <w:r>
+        <w:t xml:space="preserve">revisión de forma frente a la pauta: ortografía y redacción de la sección 1.1, expresión de las metas de la tabla de objetivos (1.3) como valores medibles, revisión de citas y referencias en formato APA e inserción del enlace al repositorio.</w:t>
+      </w:r>
+    </w:p>
+    <w:p>
+      <w:pPr>
+        <w:ind w:left="360" w:hanging="220"/>
+      </w:pPr>
+      <w:r>
+        <w:t xml:space="preserve">• </w:t>
+      </w:r>
+      <w:r>
+        <w:rPr>
+          <w:b/>
+          <w:bCs/>
+        </w:rPr>
+        <w:t xml:space="preserve">Ejemplo de instrucción utilizada: </w:t>
+      </w:r>
+      <w:r>
+        <w:t xml:space="preserve">“Revisa el informe frente a la pauta de la EP1 de ISY0101: corrige formato, citas APA y el enlace del repositorio, sin modificar las conclusiones, las justificaciones técnicas ni las reflexiones individuales”.</w:t>
+      </w:r>
+    </w:p>
+    <w:p>
+      <w:pPr>
+        <w:ind w:left="360" w:hanging="220"/>
+      </w:pPr>
+      <w:r>
+        <w:t xml:space="preserve">• </w:t>
+      </w:r>
+      <w:r>
+        <w:rPr>
+          <w:b/>
+          <w:bCs/>
+        </w:rPr>
+        <w:t xml:space="preserve">Validación: </w:t>
+      </w:r>
+      <w:r>
+        <w:t xml:space="preserve">el equipo revisó cada cambio sugerido antes de aceptarlo y ejecutó las pruebas del repositorio para comprobar el funcionamiento del código (ver carpeta evidencias/).</w:t>
+      </w:r>
+    </w:p>
+    <w:p>
+      <w:r>
+        <w:t xml:space="preserve">No se usó IA para redactar el análisis del caso, las justificaciones técnicas, las conclusiones ni las reflexiones individuales, que son de autoría del equipo.</w:t>
       </w:r>
     </w:p>
     <w:p>
@@ -5176,209 +5510,7 @@
         <w:rPr>
           <w:highlight w:val="yellow"/>
         </w:rPr>
-        <w:t>[PENDIENTE — Cindia Maldonado: redactar personalmente, SIN apoyo de IA (lo exige la pauta), en 5 a 8 líneas: qué aprendiste en el proyecto y cuál fue tu contribución concreta (qué partes hiciste).]</w:t>
-      </w:r>
-    </w:p>
-    <w:p>
-      <w:pPr>
-        <w:pStyle w:val="Ttulo2"/>
-      </w:pPr>
-      <w:r>
-        <w:t>6.2 Reflexión individual — Isaac Román</w:t>
-      </w:r>
-    </w:p>
-    <w:p>
-      <w:r>
-        <w:rPr>
-          <w:highlight w:val="yellow"/>
-        </w:rPr>
-        <w:t>[PENDIENTE — Isaac Román: redactar personalmente, SIN apoyo de IA (lo exige la pauta), en 5 a 8 líneas: qué aprendiste en el proyecto y cuál fue tu contribución concreta (qué partes hiciste).]</w:t>
-      </w:r>
-      <w:r>
-        <w:rPr>
-          <w:sz w:val="17"/>
-          <w:szCs w:val="17"/>
-        </w:rPr>
-        <w:t>Gao, Y., Xiong, Y., Gao, X., Jia, K., Pan, J., Bi, Y., Dai, Y., Sun, J., &amp; Wang, H. (2023). Retrieval-augmented generation for large language models: A survey. arXiv. https://arxiv.org/abs/2312.10997</w:t>
-      </w:r>
-    </w:p>
-    <w:p>
-      <w:pPr>
-        <w:spacing w:after="24" w:line="188" w:lineRule="auto"/>
-        <w:ind w:left="300" w:hanging="300"/>
-      </w:pPr>
-      <w:r>
-        <w:rPr>
-          <w:sz w:val="17"/>
-          <w:szCs w:val="17"/>
-        </w:rPr>
-        <w:t>L</w:t>
-      </w:r>
-      <w:r>
-        <w:rPr>
-          <w:sz w:val="17"/>
-          <w:szCs w:val="17"/>
-        </w:rPr>
-        <w:t>ewis, P., Perez, E., Piktus, A., Petroni, F., Karpukhin, V., Goyal, N., Küttler, H., Lewis, M., Yih, W., Rocktäschel, T., Riedel, S., &amp; Kiela, D. (2020). Retrieval-augmented generation for knowledge-intensive NLP tasks. Advances in Neural Information Processing Systems, 33, 9459–9474.</w:t>
-      </w:r>
-    </w:p>
-    <w:p>
-      <w:pPr>
-        <w:spacing w:after="24" w:line="188" w:lineRule="auto"/>
-        <w:ind w:left="300" w:hanging="300"/>
-      </w:pPr>
-      <w:r>
-        <w:rPr>
-          <w:sz w:val="17"/>
-          <w:szCs w:val="17"/>
-        </w:rPr>
-        <w:t>Ministerio de Minería. (2004). Decreto Supremo N° 132: Reglamento de Seguridad Minera. Diario Oficial de la República de Chile.</w:t>
-      </w:r>
-    </w:p>
-    <w:p>
-      <w:pPr>
-        <w:spacing w:after="24" w:line="188" w:lineRule="auto"/>
-        <w:ind w:left="300" w:hanging="300"/>
-      </w:pPr>
-      <w:r>
-        <w:rPr>
-          <w:sz w:val="17"/>
-          <w:szCs w:val="17"/>
-        </w:rPr>
-        <w:t>Musto, S., Barra, P., Gallo, L., &amp; Neroni, P. (2026). Avateacher: Enhancing industrial maintenance with private-network LLMs and retrieval-augmented generation. En Extended Reality. XR Salento 2025 (Lecture Notes in Computer Science, Vol. 15743, pp. 281–295). Springer. https://doi.org/10.1007/978-3-031-97781-7_21</w:t>
-      </w:r>
-    </w:p>
-    <w:p>
-      <w:pPr>
-        <w:spacing w:after="24" w:line="188" w:lineRule="auto"/>
-        <w:ind w:left="300" w:hanging="300"/>
-      </w:pPr>
-      <w:r>
-        <w:rPr>
-          <w:sz w:val="17"/>
-          <w:szCs w:val="17"/>
-        </w:rPr>
-        <w:t>OWASP Foundation. (2025). OWASP Top 10 for large language model applications. https://owasp.org/www-project-top-10-for-large-language-model-applications/</w:t>
-      </w:r>
-    </w:p>
-    <w:p>
-      <w:pPr>
-        <w:spacing w:after="24" w:line="188" w:lineRule="auto"/>
-        <w:ind w:left="300" w:hanging="300"/>
-      </w:pPr>
-      <w:r>
-        <w:rPr>
-          <w:sz w:val="17"/>
-          <w:szCs w:val="17"/>
-        </w:rPr>
-        <w:t>REDIMIN. (2026, septiembre). MinerIA del futuro: la inteligencia artificial ya entra en la producción minera chilena. Revista Digital Minera. https://www.redimin.cl</w:t>
-      </w:r>
-    </w:p>
-    <w:p>
-      <w:pPr>
-        <w:spacing w:after="24" w:line="188" w:lineRule="auto"/>
-        <w:ind w:left="300" w:hanging="300"/>
-      </w:pPr>
-      <w:r>
-        <w:rPr>
-          <w:sz w:val="17"/>
-          <w:szCs w:val="17"/>
-        </w:rPr>
-        <w:lastRenderedPageBreak/>
-        <w:t>Robertson, S., &amp; Zaragoza, H. (2009). The probabilistic relevance framework: BM25 and beyond. Foundations and Trends in Information Retrieval, 3(4), 333–389. https://doi.org/10.1561/1500000019</w:t>
-      </w:r>
-    </w:p>
-    <w:p>
-      <w:pPr>
-        <w:spacing w:after="24" w:line="188" w:lineRule="auto"/>
-        <w:ind w:left="300" w:hanging="300"/>
-      </w:pPr>
-      <w:r>
-        <w:rPr>
-          <w:sz w:val="17"/>
-          <w:szCs w:val="17"/>
-        </w:rPr>
-        <w:t>Servicio Nacional de Geología y Minería. (2026). Accidentabilidad minera 2025. SERNAGEOMIN. https://www.sernageomin.cl/accidentabilidad-minera/</w:t>
-      </w:r>
-    </w:p>
-    <w:p>
-      <w:pPr>
-        <w:spacing w:after="24" w:line="188" w:lineRule="auto"/>
-        <w:ind w:left="300" w:hanging="300"/>
-        <w:rPr>
-          <w:sz w:val="17"/>
-          <w:szCs w:val="17"/>
-        </w:rPr>
-      </w:pPr>
-      <w:r>
-        <w:rPr>
-          <w:sz w:val="17"/>
-          <w:szCs w:val="17"/>
-        </w:rPr>
-        <w:t>Yao, S., Zhao, J., Yu, D., Du, N., Shafran, I., Narasimhan, K., &amp; Cao, Y. (2023). ReAct: Synergizing reasoning and acting in language models. En International Conference on Learning Representations.</w:t>
-      </w:r>
-    </w:p>
-    <w:p>
-      <w:r>
-        <w:br w:type="page"/>
-      </w:r>
-    </w:p>
-    <w:p>
-      <w:pPr>
-        <w:pStyle w:val="Ttulo1"/>
-      </w:pPr>
-      <w:r>
-        <w:lastRenderedPageBreak/>
-        <w:t>Anexo A. Declaración de uso de inteligencia artificial</w:t>
-      </w:r>
-    </w:p>
-    <w:p>
-      <w:r>
-        <w:t>Conforme a las indicaciones de la evaluación y a la guía de Bibliotecas Duoc UC (https://bibliotecas.duoc.cl/ia), el equipo declara el siguiente uso de herramientas de IA:</w:t>
-      </w:r>
-    </w:p>
-    <w:p>
-      <w:r>
-        <w:t>• Claude (Anthropic, 2026), mediante Claude Code: revisión del formato del informe frente a la pauta (redacción, citas APA y objetivos medibles); apoyo en la programación del prototipo (código, pruebas automatizadas y README) y en la organización del repositorio.</w:t>
-      </w:r>
-    </w:p>
-    <w:p>
-      <w:pPr>
-        <w:rPr>
-          <w:highlight w:val="yellow"/>
-        </w:rPr>
-      </w:pPr>
-      <w:r>
-        <w:rPr>
-          <w:highlight w:val="yellow"/>
-        </w:rPr>
-        <w:t>[PENDIENTE — Cindia Maldonado / Isaac Román: agregar cualquier otra herramienta de IA usada (por ejemplo, para diagramas, búsqueda de referencias o redacción) y en qué parte se usó.]</w:t>
-      </w:r>
-    </w:p>
-    <w:p>
-      <w:pPr>
-        <w:rPr>
-          <w:highlight w:val="yellow"/>
-        </w:rPr>
-      </w:pPr>
-      <w:r>
-        <w:rPr>
-          <w:highlight w:val="yellow"/>
-        </w:rPr>
-        <w:t>No se usó IA para redactar las conclusiones, las justificaciones técnicas ni las reflexiones individuales. Todo el contenido apoyado por IA fue revisado y validado por el equipo.</w:t>
-      </w:r>
-    </w:p>
-    <w:p>
-      <w:pPr>
-        <w:rPr>
-          <w:highlight w:val="yellow"/>
-        </w:rPr>
-      </w:pPr>
-      <w:r>
-        <w:rPr>
-          <w:highlight w:val="yellow"/>
-        </w:rPr>
-        <w:t>[PENDIENTE — Cindia Maldonado / Isaac Román: confirmar que la frase anterior es verdadera antes de entregar; si no lo es, corregir las secciones correspondientes.]</w:t>
+        <w:t>[PENDIENTE — Cindia Maldonado / Isaac Román: si usaron otra herramienta de IA (por ejemplo, para los diagramas o para buscar referencias), agregarla aquí con el mismo formato y en Referencias; luego borrar esta línea.]</w:t>
       </w:r>
     </w:p>
     <w:sectPr>

</xml_diff>

<commit_message>
Declaración de IA: trabajo conjunto del equipo con la herramienta
- Anexo A del informe y README: el código se desarrolló en conjunto con
  Claude Code; el equipo revisó todo e hizo sus propios cambios.
- CAMBIOS.md: errores detectados en la evaluación y cómo se corrigieron.

Co-Authored-By: Claude Opus 5.5 <noreply@anthropic.com>
</commit_message>
<xml_diff>
--- a/informe/Informe Chuquicamata (corregido).docx
+++ b/informe/Informe Chuquicamata (corregido).docx
@@ -5443,7 +5443,7 @@
         <w:t xml:space="preserve">Uso en el prototipo: </w:t>
       </w:r>
       <w:r>
-        <w:t xml:space="preserve">apoyo en la programación del repositorio (código en Python, pruebas automatizadas, script de evaluación, README) y en su organización.</w:t>
+        <w:t xml:space="preserve">el equipo desarrolló el código en conjunto con la herramienta, usada como apoyo para programar, ejecutar las pruebas automatizadas y la evaluación, y detectar y corregir fallas lógicas. El equipo revisó todo el código junto con la herramienta e hizo sus propios cambios.</w:t>
       </w:r>
     </w:p>
     <w:p>
@@ -5497,7 +5497,7 @@
         <w:t xml:space="preserve">Validación: </w:t>
       </w:r>
       <w:r>
-        <w:t xml:space="preserve">el equipo revisó cada cambio sugerido antes de aceptarlo y ejecutó las pruebas del repositorio para comprobar el funcionamiento del código (ver carpeta evidencias/).</w:t>
+        <w:t xml:space="preserve">el equipo revisó cada cambio antes de aceptarlo e hizo ajustes propios; el funcionamiento se comprobó con las pruebas automatizadas y la evaluación sobre el conjunto de preguntas de prueba (carpeta evidencias/). El detalle de los cambios y errores corregidos está en CAMBIOS.md del repositorio.</w:t>
       </w:r>
     </w:p>
     <w:p>

</xml_diff>

<commit_message>
Informe: Anexo B con resultados del prototipo y mitigación de conectividad
- 5.1 remite al nuevo Anexo B (métricas: meta, primera evaluación, final).
- Tabla 5.2: respaldo con citas textuales si el modelo no responde.
- Anexo A: se declara el apoyo de IA en estas incorporaciones.

Co-Authored-By: Claude Opus 5.5 <noreply@anthropic.com>
</commit_message>
<xml_diff>
--- a/informe/Informe Chuquicamata (corregido).docx
+++ b/informe/Informe Chuquicamata (corregido).docx
@@ -4681,6 +4681,9 @@
       <w:r>
         <w:t>Se usa un conjunto de 250 preguntas validadas por expertos, de cuatro tipos: normativas directas, de diagnóstico, preguntas cuya respuesta no está en el corpus —para medir la abstención— e intentos de manipulación. Se miden faithfulness, answer relevancy, context precision y context recall con RAGAS (Es et al., 2024). Ningún cambio de prompt o de modelo pasa a producción sin superar los umbrales de OE3 a OE5.</w:t>
       </w:r>
+      <w:r>
+        <w:t xml:space="preserve"> Los resultados medidos en el prototipo están en el Anexo B.</w:t>
+      </w:r>
     </w:p>
     <w:p>
       <w:pPr>
@@ -5081,7 +5084,7 @@
                 <w:sz w:val="19"/>
                 <w:szCs w:val="19"/>
               </w:rPr>
-              <w:t>Nodos en talleres con modelo e índice replicados; mantenedores validan las respuestas.</w:t>
+              <w:t>Nodos en talleres con modelo e índice replicados; si el modelo no responde, respuesta con citas textuales; mantenedores validan las respuestas.</w:t>
             </w:r>
           </w:p>
         </w:tc>
@@ -5461,7 +5464,7 @@
         <w:t xml:space="preserve">Uso en el informe: </w:t>
       </w:r>
       <w:r>
-        <w:t xml:space="preserve">revisión de forma frente a la pauta: ortografía y redacción de la sección 1.1, expresión de las metas de la tabla de objetivos (1.3) como valores medibles, revisión de citas y referencias en formato APA e inserción del enlace al repositorio.</w:t>
+        <w:t xml:space="preserve">revisión de forma frente a la pauta: ortografía y redacción de la sección 1.1, expresión de las metas de la tabla de objetivos (1.3) como valores medibles, revisión de citas y referencias en formato APA, inserción del enlace al repositorio e incorporación de los resultados medidos del prototipo (Anexo B) y de su mitigación ante caídas del modelo (tabla 5.2).</w:t>
       </w:r>
     </w:p>
     <w:p>
@@ -5511,6 +5514,622 @@
           <w:highlight w:val="yellow"/>
         </w:rPr>
         <w:t>[PENDIENTE — Cindia Maldonado / Isaac Román: si usaron otra herramienta de IA (por ejemplo, para los diagramas o para buscar referencias), agregarla aquí con el mismo formato y en Referencias; luego borrar esta línea.]</w:t>
+      </w:r>
+    </w:p>
+    <w:p>
+      <w:pPr>
+        <w:pStyle w:val="Ttulo1"/>
+      </w:pPr>
+      <w:r>
+        <w:t>Anexo B. Resultados del prototipo</w:t>
+      </w:r>
+    </w:p>
+    <w:p>
+      <w:pPr>
+        <w:spacing w:before="80" w:after="60"/>
+      </w:pPr>
+      <w:r>
+        <w:t xml:space="preserve">Evaluación del prototipo del repositorio sobre un corpus simulado y un conjunto de 26 preguntas de los cuatro tipos descritos en 5.1 (normativas, diagnóstico, sin respuesta en el corpus y manipulación), con el generador extractivo (python eval/evaluar.py --offline). Detalle en la carpeta evidencias/ del repositorio.</w:t>
+      </w:r>
+    </w:p>
+    <w:tbl>
+      <w:tblPr>
+        <w:tblW w:w="9640" w:type="dxa"/>
+        <w:tblBorders>
+          <w:top w:val="single" w:sz="4" w:space="0" w:color="BFC7D1"/>
+          <w:left w:val="single" w:sz="4" w:space="0" w:color="BFC7D1"/>
+          <w:bottom w:val="single" w:sz="4" w:space="0" w:color="BFC7D1"/>
+          <w:right w:val="single" w:sz="4" w:space="0" w:color="BFC7D1"/>
+          <w:insideH w:val="single" w:sz="4" w:space="0" w:color="BFC7D1"/>
+          <w:insideV w:val="single" w:sz="4" w:space="0" w:color="BFC7D1"/>
+        </w:tblBorders>
+        <w:tblLayout w:type="fixed"/>
+      </w:tblPr>
+      <w:tblGrid>
+        <w:gridCol w:w="3400"/>
+        <w:gridCol w:w="2000"/>
+        <w:gridCol w:w="2000"/>
+        <w:gridCol w:w="2240"/>
+      </w:tblGrid>
+      <w:tr>
+        <w:tc>
+          <w:tcPr>
+            <w:tcW w:w="3400" w:type="dxa"/>
+            <w:shd w:val="clear" w:color="auto" w:fill="E8EEF5"/>
+          </w:tcPr>
+          <w:p>
+            <w:pPr>
+              <w:spacing w:before="20" w:after="20"/>
+            </w:pPr>
+            <w:r>
+              <w:rPr>
+                <w:b/>
+                <w:bCs/>
+                <w:sz w:val="18"/>
+                <w:szCs w:val="18"/>
+              </w:rPr>
+              <w:t xml:space="preserve">Métrica</w:t>
+            </w:r>
+          </w:p>
+        </w:tc>
+        <w:tc>
+          <w:tcPr>
+            <w:tcW w:w="2000" w:type="dxa"/>
+            <w:shd w:val="clear" w:color="auto" w:fill="E8EEF5"/>
+          </w:tcPr>
+          <w:p>
+            <w:pPr>
+              <w:spacing w:before="20" w:after="20"/>
+            </w:pPr>
+            <w:r>
+              <w:rPr>
+                <w:b/>
+                <w:bCs/>
+                <w:sz w:val="18"/>
+                <w:szCs w:val="18"/>
+              </w:rPr>
+              <w:t xml:space="preserve">Meta (sección 1.3)</w:t>
+            </w:r>
+          </w:p>
+        </w:tc>
+        <w:tc>
+          <w:tcPr>
+            <w:tcW w:w="2000" w:type="dxa"/>
+            <w:shd w:val="clear" w:color="auto" w:fill="E8EEF5"/>
+          </w:tcPr>
+          <w:p>
+            <w:pPr>
+              <w:spacing w:before="20" w:after="20"/>
+            </w:pPr>
+            <w:r>
+              <w:rPr>
+                <w:b/>
+                <w:bCs/>
+                <w:sz w:val="18"/>
+                <w:szCs w:val="18"/>
+              </w:rPr>
+              <w:t xml:space="preserve">Primera evaluación</w:t>
+            </w:r>
+          </w:p>
+        </w:tc>
+        <w:tc>
+          <w:tcPr>
+            <w:tcW w:w="2240" w:type="dxa"/>
+            <w:shd w:val="clear" w:color="auto" w:fill="E8EEF5"/>
+          </w:tcPr>
+          <w:p>
+            <w:pPr>
+              <w:spacing w:before="20" w:after="20"/>
+            </w:pPr>
+            <w:r>
+              <w:rPr>
+                <w:b/>
+                <w:bCs/>
+                <w:sz w:val="18"/>
+                <w:szCs w:val="18"/>
+              </w:rPr>
+              <w:t xml:space="preserve">Resultado final</w:t>
+            </w:r>
+          </w:p>
+        </w:tc>
+      </w:tr>
+      <w:tr>
+        <w:tc>
+          <w:tcPr>
+            <w:tcW w:w="3400" w:type="dxa"/>
+          </w:tcPr>
+          <w:p>
+            <w:pPr>
+              <w:spacing w:before="20" w:after="20"/>
+            </w:pPr>
+            <w:r>
+              <w:rPr>
+                <w:sz w:val="18"/>
+                <w:szCs w:val="18"/>
+              </w:rPr>
+              <w:t xml:space="preserve">Fidelidad (afirmaciones respaldadas)</w:t>
+            </w:r>
+          </w:p>
+        </w:tc>
+        <w:tc>
+          <w:tcPr>
+            <w:tcW w:w="2000" w:type="dxa"/>
+          </w:tcPr>
+          <w:p>
+            <w:pPr>
+              <w:spacing w:before="20" w:after="20"/>
+            </w:pPr>
+            <w:r>
+              <w:rPr>
+                <w:sz w:val="18"/>
+                <w:szCs w:val="18"/>
+              </w:rPr>
+              <w:t xml:space="preserve">≥ 0,90</w:t>
+            </w:r>
+          </w:p>
+        </w:tc>
+        <w:tc>
+          <w:tcPr>
+            <w:tcW w:w="2000" w:type="dxa"/>
+          </w:tcPr>
+          <w:p>
+            <w:pPr>
+              <w:spacing w:before="20" w:after="20"/>
+            </w:pPr>
+            <w:r>
+              <w:rPr>
+                <w:sz w:val="18"/>
+                <w:szCs w:val="18"/>
+              </w:rPr>
+              <w:t xml:space="preserve">1,00</w:t>
+            </w:r>
+          </w:p>
+        </w:tc>
+        <w:tc>
+          <w:tcPr>
+            <w:tcW w:w="2240" w:type="dxa"/>
+          </w:tcPr>
+          <w:p>
+            <w:pPr>
+              <w:spacing w:before="20" w:after="20"/>
+            </w:pPr>
+            <w:r>
+              <w:rPr>
+                <w:sz w:val="18"/>
+                <w:szCs w:val="18"/>
+              </w:rPr>
+              <w:t xml:space="preserve">1,00</w:t>
+            </w:r>
+          </w:p>
+        </w:tc>
+      </w:tr>
+      <w:tr>
+        <w:tc>
+          <w:tcPr>
+            <w:tcW w:w="3400" w:type="dxa"/>
+          </w:tcPr>
+          <w:p>
+            <w:pPr>
+              <w:spacing w:before="20" w:after="20"/>
+            </w:pPr>
+            <w:r>
+              <w:rPr>
+                <w:sz w:val="18"/>
+                <w:szCs w:val="18"/>
+              </w:rPr>
+              <w:t xml:space="preserve">Context recall@5</w:t>
+            </w:r>
+          </w:p>
+        </w:tc>
+        <w:tc>
+          <w:tcPr>
+            <w:tcW w:w="2000" w:type="dxa"/>
+          </w:tcPr>
+          <w:p>
+            <w:pPr>
+              <w:spacing w:before="20" w:after="20"/>
+            </w:pPr>
+            <w:r>
+              <w:rPr>
+                <w:sz w:val="18"/>
+                <w:szCs w:val="18"/>
+              </w:rPr>
+              <w:t xml:space="preserve">≥ 0,85</w:t>
+            </w:r>
+          </w:p>
+        </w:tc>
+        <w:tc>
+          <w:tcPr>
+            <w:tcW w:w="2000" w:type="dxa"/>
+          </w:tcPr>
+          <w:p>
+            <w:pPr>
+              <w:spacing w:before="20" w:after="20"/>
+            </w:pPr>
+            <w:r>
+              <w:rPr>
+                <w:sz w:val="18"/>
+                <w:szCs w:val="18"/>
+              </w:rPr>
+              <w:t xml:space="preserve">0,79</w:t>
+            </w:r>
+          </w:p>
+        </w:tc>
+        <w:tc>
+          <w:tcPr>
+            <w:tcW w:w="2240" w:type="dxa"/>
+          </w:tcPr>
+          <w:p>
+            <w:pPr>
+              <w:spacing w:before="20" w:after="20"/>
+            </w:pPr>
+            <w:r>
+              <w:rPr>
+                <w:sz w:val="18"/>
+                <w:szCs w:val="18"/>
+              </w:rPr>
+              <w:t xml:space="preserve">1,00</w:t>
+            </w:r>
+          </w:p>
+        </w:tc>
+      </w:tr>
+      <w:tr>
+        <w:tc>
+          <w:tcPr>
+            <w:tcW w:w="3400" w:type="dxa"/>
+          </w:tcPr>
+          <w:p>
+            <w:pPr>
+              <w:spacing w:before="20" w:after="20"/>
+            </w:pPr>
+            <w:r>
+              <w:rPr>
+                <w:sz w:val="18"/>
+                <w:szCs w:val="18"/>
+              </w:rPr>
+              <w:t xml:space="preserve">Abstención correcta</w:t>
+            </w:r>
+          </w:p>
+        </w:tc>
+        <w:tc>
+          <w:tcPr>
+            <w:tcW w:w="2000" w:type="dxa"/>
+          </w:tcPr>
+          <w:p>
+            <w:pPr>
+              <w:spacing w:before="20" w:after="20"/>
+            </w:pPr>
+            <w:r>
+              <w:rPr>
+                <w:sz w:val="18"/>
+                <w:szCs w:val="18"/>
+              </w:rPr>
+              <w:t xml:space="preserve">≥ 0,90</w:t>
+            </w:r>
+          </w:p>
+        </w:tc>
+        <w:tc>
+          <w:tcPr>
+            <w:tcW w:w="2000" w:type="dxa"/>
+          </w:tcPr>
+          <w:p>
+            <w:pPr>
+              <w:spacing w:before="20" w:after="20"/>
+            </w:pPr>
+            <w:r>
+              <w:rPr>
+                <w:sz w:val="18"/>
+                <w:szCs w:val="18"/>
+              </w:rPr>
+              <w:t xml:space="preserve">0,75</w:t>
+            </w:r>
+          </w:p>
+        </w:tc>
+        <w:tc>
+          <w:tcPr>
+            <w:tcW w:w="2240" w:type="dxa"/>
+          </w:tcPr>
+          <w:p>
+            <w:pPr>
+              <w:spacing w:before="20" w:after="20"/>
+            </w:pPr>
+            <w:r>
+              <w:rPr>
+                <w:sz w:val="18"/>
+                <w:szCs w:val="18"/>
+              </w:rPr>
+              <w:t xml:space="preserve">1,00</w:t>
+            </w:r>
+          </w:p>
+        </w:tc>
+      </w:tr>
+      <w:tr>
+        <w:tc>
+          <w:tcPr>
+            <w:tcW w:w="3400" w:type="dxa"/>
+          </w:tcPr>
+          <w:p>
+            <w:pPr>
+              <w:spacing w:before="20" w:after="20"/>
+            </w:pPr>
+            <w:r>
+              <w:rPr>
+                <w:sz w:val="18"/>
+                <w:szCs w:val="18"/>
+              </w:rPr>
+              <w:t xml:space="preserve">Resistencia a manipulación</w:t>
+            </w:r>
+          </w:p>
+        </w:tc>
+        <w:tc>
+          <w:tcPr>
+            <w:tcW w:w="2000" w:type="dxa"/>
+          </w:tcPr>
+          <w:p>
+            <w:pPr>
+              <w:spacing w:before="20" w:after="20"/>
+            </w:pPr>
+            <w:r>
+              <w:rPr>
+                <w:sz w:val="18"/>
+                <w:szCs w:val="18"/>
+              </w:rPr>
+              <w:t xml:space="preserve">1,00</w:t>
+            </w:r>
+          </w:p>
+        </w:tc>
+        <w:tc>
+          <w:tcPr>
+            <w:tcW w:w="2000" w:type="dxa"/>
+          </w:tcPr>
+          <w:p>
+            <w:pPr>
+              <w:spacing w:before="20" w:after="20"/>
+            </w:pPr>
+            <w:r>
+              <w:rPr>
+                <w:sz w:val="18"/>
+                <w:szCs w:val="18"/>
+              </w:rPr>
+              <w:t xml:space="preserve">1,00</w:t>
+            </w:r>
+          </w:p>
+        </w:tc>
+        <w:tc>
+          <w:tcPr>
+            <w:tcW w:w="2240" w:type="dxa"/>
+          </w:tcPr>
+          <w:p>
+            <w:pPr>
+              <w:spacing w:before="20" w:after="20"/>
+            </w:pPr>
+            <w:r>
+              <w:rPr>
+                <w:sz w:val="18"/>
+                <w:szCs w:val="18"/>
+              </w:rPr>
+              <w:t xml:space="preserve">1,00</w:t>
+            </w:r>
+          </w:p>
+        </w:tc>
+      </w:tr>
+      <w:tr>
+        <w:tc>
+          <w:tcPr>
+            <w:tcW w:w="3400" w:type="dxa"/>
+          </w:tcPr>
+          <w:p>
+            <w:pPr>
+              <w:spacing w:before="20" w:after="20"/>
+            </w:pPr>
+            <w:r>
+              <w:rPr>
+                <w:sz w:val="18"/>
+                <w:szCs w:val="18"/>
+              </w:rPr>
+              <w:t xml:space="preserve">Usos de revisiones superadas</w:t>
+            </w:r>
+          </w:p>
+        </w:tc>
+        <w:tc>
+          <w:tcPr>
+            <w:tcW w:w="2000" w:type="dxa"/>
+          </w:tcPr>
+          <w:p>
+            <w:pPr>
+              <w:spacing w:before="20" w:after="20"/>
+            </w:pPr>
+            <w:r>
+              <w:rPr>
+                <w:sz w:val="18"/>
+                <w:szCs w:val="18"/>
+              </w:rPr>
+              <w:t xml:space="preserve">0</w:t>
+            </w:r>
+          </w:p>
+        </w:tc>
+        <w:tc>
+          <w:tcPr>
+            <w:tcW w:w="2000" w:type="dxa"/>
+          </w:tcPr>
+          <w:p>
+            <w:pPr>
+              <w:spacing w:before="20" w:after="20"/>
+            </w:pPr>
+            <w:r>
+              <w:rPr>
+                <w:sz w:val="18"/>
+                <w:szCs w:val="18"/>
+              </w:rPr>
+              <w:t xml:space="preserve">0</w:t>
+            </w:r>
+          </w:p>
+        </w:tc>
+        <w:tc>
+          <w:tcPr>
+            <w:tcW w:w="2240" w:type="dxa"/>
+          </w:tcPr>
+          <w:p>
+            <w:pPr>
+              <w:spacing w:before="20" w:after="20"/>
+            </w:pPr>
+            <w:r>
+              <w:rPr>
+                <w:sz w:val="18"/>
+                <w:szCs w:val="18"/>
+              </w:rPr>
+              <w:t xml:space="preserve">0</w:t>
+            </w:r>
+          </w:p>
+        </w:tc>
+      </w:tr>
+      <w:tr>
+        <w:tc>
+          <w:tcPr>
+            <w:tcW w:w="3400" w:type="dxa"/>
+          </w:tcPr>
+          <w:p>
+            <w:pPr>
+              <w:spacing w:before="20" w:after="20"/>
+            </w:pPr>
+            <w:r>
+              <w:rPr>
+                <w:sz w:val="18"/>
+                <w:szCs w:val="18"/>
+              </w:rPr>
+              <w:t xml:space="preserve">Latencia p95 (RNF-01)</w:t>
+            </w:r>
+          </w:p>
+        </w:tc>
+        <w:tc>
+          <w:tcPr>
+            <w:tcW w:w="2000" w:type="dxa"/>
+          </w:tcPr>
+          <w:p>
+            <w:pPr>
+              <w:spacing w:before="20" w:after="20"/>
+            </w:pPr>
+            <w:r>
+              <w:rPr>
+                <w:sz w:val="18"/>
+                <w:szCs w:val="18"/>
+              </w:rPr>
+              <w:t xml:space="preserve">&lt; 8 s</w:t>
+            </w:r>
+          </w:p>
+        </w:tc>
+        <w:tc>
+          <w:tcPr>
+            <w:tcW w:w="2000" w:type="dxa"/>
+          </w:tcPr>
+          <w:p>
+            <w:pPr>
+              <w:spacing w:before="20" w:after="20"/>
+            </w:pPr>
+            <w:r>
+              <w:rPr>
+                <w:sz w:val="18"/>
+                <w:szCs w:val="18"/>
+              </w:rPr>
+              <w:t xml:space="preserve">6,1 s</w:t>
+            </w:r>
+          </w:p>
+        </w:tc>
+        <w:tc>
+          <w:tcPr>
+            <w:tcW w:w="2240" w:type="dxa"/>
+          </w:tcPr>
+          <w:p>
+            <w:pPr>
+              <w:spacing w:before="20" w:after="20"/>
+            </w:pPr>
+            <w:r>
+              <w:rPr>
+                <w:sz w:val="18"/>
+                <w:szCs w:val="18"/>
+              </w:rPr>
+              <w:t xml:space="preserve">5,9 s</w:t>
+            </w:r>
+          </w:p>
+        </w:tc>
+      </w:tr>
+      <w:tr>
+        <w:tc>
+          <w:tcPr>
+            <w:tcW w:w="3400" w:type="dxa"/>
+          </w:tcPr>
+          <w:p>
+            <w:pPr>
+              <w:spacing w:before="20" w:after="20"/>
+            </w:pPr>
+            <w:r>
+              <w:rPr>
+                <w:sz w:val="18"/>
+                <w:szCs w:val="18"/>
+              </w:rPr>
+              <w:t xml:space="preserve">Pruebas automatizadas (pytest)</w:t>
+            </w:r>
+          </w:p>
+        </w:tc>
+        <w:tc>
+          <w:tcPr>
+            <w:tcW w:w="2000" w:type="dxa"/>
+          </w:tcPr>
+          <w:p>
+            <w:pPr>
+              <w:spacing w:before="20" w:after="20"/>
+            </w:pPr>
+            <w:r>
+              <w:rPr>
+                <w:sz w:val="18"/>
+                <w:szCs w:val="18"/>
+              </w:rPr>
+              <w:t xml:space="preserve">Todas</w:t>
+            </w:r>
+          </w:p>
+        </w:tc>
+        <w:tc>
+          <w:tcPr>
+            <w:tcW w:w="2000" w:type="dxa"/>
+          </w:tcPr>
+          <w:p>
+            <w:pPr>
+              <w:spacing w:before="20" w:after="20"/>
+            </w:pPr>
+            <w:r>
+              <w:rPr>
+                <w:sz w:val="18"/>
+                <w:szCs w:val="18"/>
+              </w:rPr>
+              <w:t xml:space="preserve">29 de 32</w:t>
+            </w:r>
+          </w:p>
+        </w:tc>
+        <w:tc>
+          <w:tcPr>
+            <w:tcW w:w="2240" w:type="dxa"/>
+          </w:tcPr>
+          <w:p>
+            <w:pPr>
+              <w:spacing w:before="20" w:after="20"/>
+            </w:pPr>
+            <w:r>
+              <w:rPr>
+                <w:sz w:val="18"/>
+                <w:szCs w:val="18"/>
+              </w:rPr>
+              <w:t xml:space="preserve">35 de 35</w:t>
+            </w:r>
+          </w:p>
+        </w:tc>
+      </w:tr>
+    </w:tbl>
+    <w:p>
+      <w:pPr>
+        <w:spacing w:before="80" w:after="60"/>
+      </w:pPr>
+      <w:r>
+        <w:t xml:space="preserve">La primera evaluación no cumplía dos metas por abstenciones indebidas: preguntas con respuesta en el corpus se clasificaban hacia un agente cuyo filtro excluía el documento correcto (por ejemplo, la hoja de seguridad ante una ingestión). Se corrigió la clasificación de intención y el glosario bilingüe; el detalle de cada error y su corrección está en CAMBIOS.md. Estas cifras validan el diseño sobre datos simulados, no la operación real: el umbral de abstención debe recalibrarse con el corpus de la División.</w:t>
       </w:r>
     </w:p>
     <w:sectPr>

</xml_diff>

<commit_message>
Informe completo: reflexiones y correcciones del equipo integradas
- Reflexiones individuales 6.1 (Cindia) y 6.2 (Isaac), escritas por ellos.
- Correcciones del equipo: tilde del docente, OE1, regla 5 del prompt,
  fila Conectividad de 5.2 y referencias con DOI.
- Sin pendientes: se quita la línea amarilla del Anexo A.

Co-Authored-By: Claude Opus 5.5 <noreply@anthropic.com>
</commit_message>
<xml_diff>
--- a/informe/Informe Chuquicamata (corregido).docx
+++ b/informe/Informe Chuquicamata (corregido).docx
@@ -224,7 +224,7 @@
                 <w:sz w:val="19"/>
                 <w:szCs w:val="19"/>
               </w:rPr>
-              <w:t>Cristian Andres Carcamo Mansilla</w:t>
+              <w:t>Cristian Andrés Carcamo Mansilla</w:t>
             </w:r>
           </w:p>
         </w:tc>
@@ -1401,7 +1401,7 @@
                 <w:sz w:val="19"/>
                 <w:szCs w:val="19"/>
               </w:rPr>
-              <w:t>Nada cargado 0%</w:t>
+              <w:t>0 %</w:t>
             </w:r>
           </w:p>
         </w:tc>
@@ -2195,7 +2195,7 @@
           <w:sz w:val="17"/>
           <w:szCs w:val="17"/>
         </w:rPr>
-        <w:t>5. Antes de toda instrucción de intervención, antepone el bloqueo y aislamiento de</w:t>
+        <w:t>5. Antes de toda instrucción de intervención, antepón el bloqueo y aislamiento de</w:t>
       </w:r>
     </w:p>
     <w:p>
@@ -5084,7 +5084,7 @@
                 <w:sz w:val="19"/>
                 <w:szCs w:val="19"/>
               </w:rPr>
-              <w:t>Nodos en talleres con modelo e índice replicados; si el modelo no responde, respuesta con citas textuales; mantenedores validan las respuestas.</w:t>
+              <w:t>Nodos en talleres con el modelo ligero y el índice replicados (el de 70B queda centralizado); si el modelo no responde, respuesta con citas textuales; mantenedores validan las respuestas.</w:t>
             </w:r>
           </w:p>
         </w:tc>
@@ -5150,11 +5150,12 @@
       </w:r>
     </w:p>
     <w:p>
-      <w:r>
-        <w:rPr>
-          <w:highlight w:val="yellow"/>
-        </w:rPr>
-        <w:t>[PENDIENTE — Cindia Maldonado: redactar personalmente, SIN apoyo de IA (lo exige la pauta), en 5 a 8 líneas: qué aprendiste en el proyecto y cuál fue tu contribución concreta (qué partes hiciste).]</w:t>
+      <w:pPr>
+        <w:spacing w:after="100" w:line="238" w:lineRule="auto"/>
+        <w:jc w:val="both"/>
+      </w:pPr>
+      <w:r>
+        <w:t xml:space="preserve">Durante este proyecto aprendí a combinar un LLM con RAG para que las respuestas salgan de los documentos de la faena y no del conocimiento general del modelo. Lo que más me quedó es que, en un contexto de seguridad, abstenerse es mejor que responder algo inventado, y que por eso el sistema debe derivar la consulta cuando no encuentra respaldo. Me encargué de formular los prompts de los agentes y del verificador, y desarrollé el prototipo junto a Isaac; además, organicé la información y participé en la preparación del informe.</w:t>
       </w:r>
     </w:p>
     <w:p>
@@ -5174,11 +5175,12 @@
       </w:r>
     </w:p>
     <w:p>
-      <w:r>
-        <w:rPr>
-          <w:highlight w:val="yellow"/>
-        </w:rPr>
-        <w:t>[PENDIENTE — Isaac Román: redactar personalmente, SIN apoyo de IA (lo exige la pauta), en 5 a 8 líneas: qué aprendiste en el proyecto y cuál fue tu contribución concreta (qué partes hiciste).]</w:t>
+      <w:pPr>
+        <w:spacing w:after="100" w:line="238" w:lineRule="auto"/>
+        <w:jc w:val="both"/>
+      </w:pPr>
+      <w:r>
+        <w:t xml:space="preserve">Durante este proyecto aprendí cómo se integran LLM, RAG y agentes inteligentes en una sola solución, y por qué conviene separar los agentes para darle a cada uno solo los permisos que necesita. También entendí que la calidad de las respuestas depende tanto del corpus como del modelo: hay que organizar las fuentes, indexar solo documentos vigentes y verificar cada respuesta antes de entregarla. Me encargué de elaborar los diagramas de flujo y de arquitectura, y desarrollé el prototipo junto a Cindia; además, participé en la revisión del proyecto y en la preparación del informe.</w:t>
       </w:r>
     </w:p>
     <w:p>
@@ -5236,7 +5238,7 @@
           <w:sz w:val="17"/>
           <w:szCs w:val="17"/>
         </w:rPr>
-        <w:t xml:space="preserve">Chen, J., Xiao, S., Zhang, P., Luo, K., Lian, D., &amp; Liu, Z. (2024). BGE M3-Embedding: Multi-lingual, multi-functionality, multi-granularity text embeddings through self-knowledge distillation. arXiv. https://arxiv.org/abs/2402.03216</w:t>
+        <w:t xml:space="preserve">Chen, J., Xiao, S., Zhang, P., Luo, K., Lian, D., &amp; Liu, Z. (2024). M3-embedding: Multi-linguality, multi-functionality, multi-granularity text embeddings through self-knowledge distillation. En Findings of the Association for Computational Linguistics: ACL 2024 (pp. 2318–2335). Association for Computational Linguistics. https://doi.org/10.18653/v1/2024.findings-acl.137</w:t>
       </w:r>
     </w:p>
     <w:p>
@@ -5262,7 +5264,7 @@
           <w:sz w:val="17"/>
           <w:szCs w:val="17"/>
         </w:rPr>
-        <w:t xml:space="preserve">Es, S., James, J., Espinosa-Anke, L., &amp; Schockaert, S. (2024). RAGAS: Automated evaluation of retrieval augmented generation. En Proceedings of the 18th Conference of the European Chapter of the Association for Computational Linguistics: System Demonstrations (pp. 150–158). Association for Computational Linguistics.</w:t>
+        <w:t xml:space="preserve">Es, S., James, J., Espinosa-Anke, L., &amp; Schockaert, S. (2024). RAGAS: Automated evaluation of retrieval augmented generation. En Proceedings of the 18th Conference of the European Chapter of the Association for Computational Linguistics: System Demonstrations (pp. 150–158). Association for Computational Linguistics. https://doi.org/10.18653/v1/2024.eacl-demo.16</w:t>
       </w:r>
     </w:p>
     <w:p>
@@ -5275,7 +5277,7 @@
           <w:sz w:val="17"/>
           <w:szCs w:val="17"/>
         </w:rPr>
-        <w:t>Gao, Y., Xiong, Y., Gao, X., Jia, K., Pan, J., Bi, Y., Dai, Y., Sun, J., &amp; Wang, H. (2023). Retrieval-augmented generation for large language models: A survey. arXiv. https://arxiv.org/abs/2312.10997</w:t>
+        <w:t xml:space="preserve">Gao, Y., Xiong, Y., Gao, X., Jia, K., Pan, J., Bi, Y., Dai, Y., Sun, J., Wang, M., &amp; Wang, H. (2023). Retrieval-augmented generation for large language models: A survey. arXiv. https://doi.org/10.48550/arXiv.2312.10997</w:t>
       </w:r>
     </w:p>
     <w:p>
@@ -5506,14 +5508,6 @@
     <w:p>
       <w:r>
         <w:t xml:space="preserve">No se usó IA para redactar el análisis del caso, las justificaciones técnicas, las conclusiones ni las reflexiones individuales, que son de autoría del equipo.</w:t>
-      </w:r>
-    </w:p>
-    <w:p>
-      <w:r>
-        <w:rPr>
-          <w:highlight w:val="yellow"/>
-        </w:rPr>
-        <w:t>[PENDIENTE — Cindia Maldonado / Isaac Román: si usaron otra herramienta de IA (por ejemplo, para los diagramas o para buscar referencias), agregarla aquí con el mismo formato y en Referencias; luego borrar esta línea.]</w:t>
       </w:r>
     </w:p>
     <w:p>

</xml_diff>

<commit_message>
Evidencia de la evaluación con el LLM local y su análisis
- evidencias/evaluacion_llm.*: calidad 1,0 pero latencia p95 302 s en CPU.
- El verificador rechazó 17 de 19 borradores del modelo de 0,8B y el
  reintento extractivo los reemplazó: no es falla del código, es límite
  del modelo pequeño. Reportado en el Anexo B y en CAMBIOS.md.
- README: modo offline recomendado para la demo sin GPU.

Co-Authored-By: Claude Opus 5.5 <noreply@anthropic.com>
</commit_message>
<xml_diff>
--- a/informe/Informe Chuquicamata (corregido).docx
+++ b/informe/Informe Chuquicamata (corregido).docx
@@ -6124,6 +6124,14 @@
       </w:pPr>
       <w:r>
         <w:t xml:space="preserve">La primera evaluación no cumplía dos metas por abstenciones indebidas: preguntas con respuesta en el corpus se clasificaban hacia un agente cuyo filtro excluía el documento correcto (por ejemplo, la hoja de seguridad ante una ingestión). Se corrigió la clasificación de intención y el glosario bilingüe; el detalle de cada error y su corrección está en CAMBIOS.md. Estas cifras validan el diseño sobre datos simulados, no la operación real: el umbral de abstención debe recalibrarse con el corpus de la División.</w:t>
+      </w:r>
+    </w:p>
+    <w:p>
+      <w:pPr>
+        <w:spacing w:before="80" w:after="60"/>
+      </w:pPr>
+      <w:r>
+        <w:t xml:space="preserve">Con el modelo de lenguaje pequeño local (qwen3.5:0.8b en Ollama, solo CPU; python eval/evaluar.py) se mantienen las métricas de calidad (fidelidad, recall@5, abstención correcta y resistencia a manipulación de 1,0), pero porque el verificador rechazó 17 de los 19 borradores del modelo (sin citas o con abstenciones erróneas) y el reintento extractivo los reemplazó; un borrador más no llegó a tiempo. La latencia (p50 175 s, p95 302 s) no cumple RNF-01 en este equipo: depende del tamaño del modelo y del hardware, por lo que el diseño de producción usa el modelo de 70B con vLLM (sección 4.1).</w:t>
       </w:r>
     </w:p>
     <w:sectPr>

</xml_diff>